<commit_message>
Update 8- Examine and complete the indoor scene.docx
</commit_message>
<xml_diff>
--- a/Unit 10 - Lighting/8- Examine and complete the indoor scene.docx
+++ b/Unit 10 - Lighting/8- Examine and complete the indoor scene.docx
@@ -171,21 +171,12 @@
       <w:r>
         <w:t xml:space="preserve">&gt; </w:t>
       </w:r>
-      <w:proofErr w:type="spellStart"/>
-      <w:r>
-        <w:rPr>
-          <w:b/>
-          <w:bCs/>
-        </w:rPr>
-        <w:t>CreativeCore_Lighting</w:t>
-      </w:r>
-      <w:proofErr w:type="spellEnd"/>
-      <w:r>
-        <w:rPr>
-          <w:b/>
-          <w:bCs/>
-        </w:rPr>
-        <w:t xml:space="preserve"> </w:t>
+      <w:r>
+        <w:rPr>
+          <w:b/>
+          <w:bCs/>
+        </w:rPr>
+        <w:t xml:space="preserve">CreativeCore_Lighting </w:t>
       </w:r>
       <w:r>
         <w:t xml:space="preserve">&gt; </w:t>
@@ -200,7 +191,6 @@
       <w:r>
         <w:t xml:space="preserve"> and open the </w:t>
       </w:r>
-      <w:proofErr w:type="spellStart"/>
       <w:r>
         <w:rPr>
           <w:b/>
@@ -208,7 +198,6 @@
         </w:rPr>
         <w:t>FinalScene_Lighting_Indoor</w:t>
       </w:r>
-      <w:proofErr w:type="spellEnd"/>
       <w:r>
         <w:t xml:space="preserve"> scene.</w:t>
       </w:r>
@@ -326,7 +315,6 @@
       <w:r>
         <w:t xml:space="preserve"> Open the </w:t>
       </w:r>
-      <w:proofErr w:type="spellStart"/>
       <w:r>
         <w:rPr>
           <w:b/>
@@ -339,15 +327,7 @@
           <w:b/>
           <w:bCs/>
         </w:rPr>
-        <w:t>Scene_Lighting_Indoor</w:t>
-      </w:r>
-      <w:proofErr w:type="spellEnd"/>
-      <w:r>
-        <w:rPr>
-          <w:b/>
-          <w:bCs/>
-        </w:rPr>
-        <w:t xml:space="preserve"> </w:t>
+        <w:t xml:space="preserve">Scene_Lighting_Indoor </w:t>
       </w:r>
       <w:r>
         <w:t>scene.</w:t>
@@ -561,11 +541,6 @@
       </w:r>
     </w:p>
     <w:p>
-      <w:r>
-        <w:t>Mark step incomplete</w:t>
-      </w:r>
-    </w:p>
-    <w:p>
       <w:pPr>
         <w:rPr>
           <w:b/>
@@ -578,15 +553,6 @@
           <w:bCs/>
         </w:rPr>
         <w:t>5. What are the key considerations for indoor lighting?</w:t>
-      </w:r>
-    </w:p>
-    <w:p>
-      <w:r>
-        <w:rPr>
-          <w:b/>
-          <w:bCs/>
-        </w:rPr>
-        <w:t>Q&amp;A (0)</w:t>
       </w:r>
     </w:p>
     <w:p>
@@ -612,12 +578,15 @@
     </w:p>
     <w:p>
       <w:r>
+        <w:t>The basic lighting that’s been set up is a good start — it functionally illuminates the space and is broadly appropriate for a gallery. However, it’s still quite dark in there and there are some issues that need to be addressed to improve the overall look of the scene.</w:t>
+      </w:r>
+    </w:p>
+    <w:p>
+      <w:r>
+        <w:rPr>
+          <w:noProof/>
+        </w:rPr>
         <w:lastRenderedPageBreak/>
-        <w:t>The basic lighting that’s been set up is a good start — it functionally illuminates the space and is broadly appropriate for a gallery. However, it’s still quite dark in there and there are some issues that need to be addressed to improve the overall look of the scene.</w:t>
-      </w:r>
-    </w:p>
-    <w:p>
-      <w:r>
         <w:drawing>
           <wp:inline distT="0" distB="0" distL="0" distR="0" wp14:anchorId="728F4B4F" wp14:editId="1FAD070D">
             <wp:extent cx="5943600" cy="3790315"/>
@@ -700,11 +669,6 @@
       </w:r>
     </w:p>
     <w:p>
-      <w:r>
-        <w:t>Mark step incomplete</w:t>
-      </w:r>
-    </w:p>
-    <w:p>
       <w:pPr>
         <w:rPr>
           <w:b/>
@@ -778,40 +742,70 @@
     </w:p>
     <w:p>
       <w:r>
+        <w:t>Add an emissive strip light to the ceiling in the gallery:</w:t>
+      </w:r>
+    </w:p>
+    <w:p>
+      <w:r>
+        <w:rPr>
+          <w:b/>
+          <w:bCs/>
+        </w:rPr>
+        <w:t>1.</w:t>
+      </w:r>
+      <w:r>
+        <w:t xml:space="preserve"> In the Project window, go to </w:t>
+      </w:r>
+      <w:r>
+        <w:rPr>
+          <w:b/>
+          <w:bCs/>
+        </w:rPr>
+        <w:t xml:space="preserve">Assets </w:t>
+      </w:r>
+      <w:r>
+        <w:t xml:space="preserve">&gt; </w:t>
+      </w:r>
+      <w:r>
+        <w:rPr>
+          <w:b/>
+          <w:bCs/>
+        </w:rPr>
+        <w:t>CreativeCore_Lighting</w:t>
+      </w:r>
+      <w:r>
+        <w:t xml:space="preserve"> &gt; </w:t>
+      </w:r>
+      <w:r>
+        <w:rPr>
+          <w:b/>
+          <w:bCs/>
+        </w:rPr>
+        <w:t>Materials</w:t>
+      </w:r>
+      <w:r>
+        <w:t>.</w:t>
+      </w:r>
+    </w:p>
+    <w:p>
+      <w:r>
+        <w:rPr>
+          <w:b/>
+          <w:bCs/>
+        </w:rPr>
         <w:lastRenderedPageBreak/>
-        <w:t>Add an emissive strip light to the ceiling in the gallery:</w:t>
-      </w:r>
-    </w:p>
-    <w:p>
-      <w:r>
-        <w:rPr>
-          <w:b/>
-          <w:bCs/>
-        </w:rPr>
-        <w:t>1.</w:t>
-      </w:r>
-      <w:r>
-        <w:t xml:space="preserve"> In the Project window, go to </w:t>
-      </w:r>
-      <w:r>
-        <w:rPr>
-          <w:b/>
-          <w:bCs/>
-        </w:rPr>
-        <w:t xml:space="preserve">Assets </w:t>
-      </w:r>
-      <w:r>
-        <w:t xml:space="preserve">&gt; </w:t>
-      </w:r>
-      <w:proofErr w:type="spellStart"/>
-      <w:r>
-        <w:rPr>
-          <w:b/>
-          <w:bCs/>
-        </w:rPr>
-        <w:t>CreativeCore_Lighting</w:t>
-      </w:r>
-      <w:proofErr w:type="spellEnd"/>
+        <w:t xml:space="preserve">2. </w:t>
+      </w:r>
+      <w:r>
+        <w:t xml:space="preserve">In the folder, right-click and select </w:t>
+      </w:r>
+      <w:r>
+        <w:rPr>
+          <w:b/>
+          <w:bCs/>
+        </w:rPr>
+        <w:t>Create</w:t>
+      </w:r>
       <w:r>
         <w:t xml:space="preserve"> &gt; </w:t>
       </w:r>
@@ -820,7 +814,39 @@
           <w:b/>
           <w:bCs/>
         </w:rPr>
-        <w:t>Materials</w:t>
+        <w:t>Material</w:t>
+      </w:r>
+      <w:r>
+        <w:t>. Name your new material “Emissive”, or something that you will easily remember. If you’ve already created an emissive material, you can use that instead.</w:t>
+      </w:r>
+    </w:p>
+    <w:p>
+      <w:r>
+        <w:rPr>
+          <w:b/>
+          <w:bCs/>
+        </w:rPr>
+        <w:t>3.</w:t>
+      </w:r>
+      <w:r>
+        <w:t xml:space="preserve"> In the Inspector, set the material’s </w:t>
+      </w:r>
+      <w:r>
+        <w:rPr>
+          <w:b/>
+          <w:bCs/>
+        </w:rPr>
+        <w:t>Workflow Mode</w:t>
+      </w:r>
+      <w:r>
+        <w:t xml:space="preserve"> to </w:t>
+      </w:r>
+      <w:r>
+        <w:rPr>
+          <w:b/>
+          <w:bCs/>
+        </w:rPr>
+        <w:t>Specular</w:t>
       </w:r>
       <w:r>
         <w:t>.</w:t>
@@ -832,59 +858,59 @@
           <w:b/>
           <w:bCs/>
         </w:rPr>
-        <w:t xml:space="preserve">2. </w:t>
-      </w:r>
-      <w:r>
-        <w:t xml:space="preserve">In the folder, right-click and select </w:t>
-      </w:r>
-      <w:r>
-        <w:rPr>
-          <w:b/>
-          <w:bCs/>
-        </w:rPr>
-        <w:t>Create</w:t>
-      </w:r>
-      <w:r>
-        <w:t xml:space="preserve"> &gt; </w:t>
-      </w:r>
-      <w:r>
-        <w:rPr>
-          <w:b/>
-          <w:bCs/>
-        </w:rPr>
-        <w:t>Material</w:t>
-      </w:r>
-      <w:r>
-        <w:t>. Name your new material “Emissive”, or something that you will easily remember. If you’ve already created an emissive material, you can use that instead.</w:t>
-      </w:r>
-    </w:p>
-    <w:p>
-      <w:r>
-        <w:rPr>
-          <w:b/>
-          <w:bCs/>
-        </w:rPr>
-        <w:t>3.</w:t>
-      </w:r>
-      <w:r>
-        <w:t xml:space="preserve"> In the Inspector, set the material’s </w:t>
-      </w:r>
-      <w:r>
-        <w:rPr>
-          <w:b/>
-          <w:bCs/>
-        </w:rPr>
-        <w:t>Workflow Mode</w:t>
-      </w:r>
-      <w:r>
-        <w:t xml:space="preserve"> to </w:t>
-      </w:r>
-      <w:r>
-        <w:rPr>
-          <w:b/>
-          <w:bCs/>
-        </w:rPr>
-        <w:t>Specular</w:t>
+        <w:t xml:space="preserve">4. </w:t>
+      </w:r>
+      <w:r>
+        <w:t xml:space="preserve">Enable the </w:t>
+      </w:r>
+      <w:r>
+        <w:rPr>
+          <w:b/>
+          <w:bCs/>
+        </w:rPr>
+        <w:t>Emission</w:t>
+      </w:r>
+      <w:r>
+        <w:t xml:space="preserve"> property.</w:t>
+      </w:r>
+    </w:p>
+    <w:p>
+      <w:r>
+        <w:rPr>
+          <w:b/>
+          <w:bCs/>
+        </w:rPr>
+        <w:t>5.</w:t>
+      </w:r>
+      <w:r>
+        <w:t xml:space="preserve"> In the Hierarchy, expand the GameObject nesting to go to </w:t>
+      </w:r>
+      <w:r>
+        <w:rPr>
+          <w:b/>
+          <w:bCs/>
+        </w:rPr>
+        <w:t xml:space="preserve">Environment </w:t>
+      </w:r>
+      <w:r>
+        <w:t>&gt;</w:t>
+      </w:r>
+      <w:r>
+        <w:rPr>
+          <w:b/>
+          <w:bCs/>
+        </w:rPr>
+        <w:t xml:space="preserve"> GalleryInterior </w:t>
+      </w:r>
+      <w:r>
+        <w:t>&gt;</w:t>
+      </w:r>
+      <w:r>
+        <w:rPr>
+          <w:b/>
+          <w:bCs/>
+        </w:rPr>
+        <w:t xml:space="preserve"> LightingBeam</w:t>
       </w:r>
       <w:r>
         <w:t>.</w:t>
@@ -893,102 +919,8 @@
     <w:p>
       <w:r>
         <w:rPr>
-          <w:b/>
-          <w:bCs/>
-        </w:rPr>
-        <w:t xml:space="preserve">4. </w:t>
-      </w:r>
-      <w:r>
-        <w:t xml:space="preserve">Enable the </w:t>
-      </w:r>
-      <w:r>
-        <w:rPr>
-          <w:b/>
-          <w:bCs/>
-        </w:rPr>
-        <w:t>Emission</w:t>
-      </w:r>
-      <w:r>
-        <w:t xml:space="preserve"> property.</w:t>
-      </w:r>
-    </w:p>
-    <w:p>
-      <w:r>
-        <w:rPr>
-          <w:b/>
-          <w:bCs/>
-        </w:rPr>
-        <w:t>5.</w:t>
-      </w:r>
-      <w:r>
-        <w:t xml:space="preserve"> In the Hierarchy, expand the </w:t>
-      </w:r>
-      <w:proofErr w:type="spellStart"/>
-      <w:r>
-        <w:t>GameObject</w:t>
-      </w:r>
-      <w:proofErr w:type="spellEnd"/>
-      <w:r>
-        <w:t xml:space="preserve"> nesting to go to </w:t>
-      </w:r>
-      <w:r>
-        <w:rPr>
-          <w:b/>
-          <w:bCs/>
-        </w:rPr>
-        <w:t xml:space="preserve">Environment </w:t>
-      </w:r>
-      <w:r>
-        <w:t>&gt;</w:t>
-      </w:r>
-      <w:r>
-        <w:rPr>
-          <w:b/>
-          <w:bCs/>
-        </w:rPr>
-        <w:t xml:space="preserve"> </w:t>
-      </w:r>
-      <w:proofErr w:type="spellStart"/>
-      <w:r>
-        <w:rPr>
-          <w:b/>
-          <w:bCs/>
-        </w:rPr>
-        <w:t>GalleryInterior</w:t>
-      </w:r>
-      <w:proofErr w:type="spellEnd"/>
-      <w:r>
-        <w:rPr>
-          <w:b/>
-          <w:bCs/>
-        </w:rPr>
-        <w:t xml:space="preserve"> </w:t>
-      </w:r>
-      <w:r>
-        <w:t>&gt;</w:t>
-      </w:r>
-      <w:r>
-        <w:rPr>
-          <w:b/>
-          <w:bCs/>
-        </w:rPr>
-        <w:t xml:space="preserve"> </w:t>
-      </w:r>
-      <w:proofErr w:type="spellStart"/>
-      <w:r>
-        <w:rPr>
-          <w:b/>
-          <w:bCs/>
-        </w:rPr>
-        <w:t>LightingBeam</w:t>
-      </w:r>
-      <w:proofErr w:type="spellEnd"/>
-      <w:r>
-        <w:t>.</w:t>
-      </w:r>
-    </w:p>
-    <w:p>
-      <w:r>
+          <w:noProof/>
+        </w:rPr>
         <w:drawing>
           <wp:inline distT="0" distB="0" distL="0" distR="0" wp14:anchorId="7E48FB86" wp14:editId="0E95EB3D">
             <wp:extent cx="5943600" cy="2239010"/>
@@ -1051,7 +983,6 @@
       <w:r>
         <w:t xml:space="preserve">. In the Inspector, check that the </w:t>
       </w:r>
-      <w:proofErr w:type="spellStart"/>
       <w:r>
         <w:rPr>
           <w:b/>
@@ -1059,17 +990,8 @@
         </w:rPr>
         <w:t>LightingBeam</w:t>
       </w:r>
-      <w:proofErr w:type="spellEnd"/>
-      <w:r>
-        <w:t xml:space="preserve"> </w:t>
-      </w:r>
-      <w:proofErr w:type="spellStart"/>
-      <w:r>
-        <w:t>GameObject</w:t>
-      </w:r>
-      <w:proofErr w:type="spellEnd"/>
-      <w:r>
-        <w:t xml:space="preserve"> is set as </w:t>
+      <w:r>
+        <w:t xml:space="preserve"> GameObject is set as </w:t>
       </w:r>
       <w:r>
         <w:rPr>
@@ -1093,7 +1015,6 @@
       <w:r>
         <w:t xml:space="preserve">: If the </w:t>
       </w:r>
-      <w:proofErr w:type="spellStart"/>
       <w:r>
         <w:rPr>
           <w:b/>
@@ -1101,7 +1022,6 @@
         </w:rPr>
         <w:t>LightingBeam</w:t>
       </w:r>
-      <w:proofErr w:type="spellEnd"/>
       <w:r>
         <w:t xml:space="preserve"> is not set as Static, this will cause issues with the bake that you will complete in the next step.</w:t>
       </w:r>
@@ -1140,6 +1060,9 @@
     </w:p>
     <w:p>
       <w:r>
+        <w:rPr>
+          <w:noProof/>
+        </w:rPr>
         <w:lastRenderedPageBreak/>
         <w:drawing>
           <wp:inline distT="0" distB="0" distL="0" distR="0" wp14:anchorId="50E63E30" wp14:editId="48A283A6">
@@ -1232,6 +1155,9 @@
     </w:p>
     <w:p>
       <w:r>
+        <w:rPr>
+          <w:noProof/>
+        </w:rPr>
         <w:drawing>
           <wp:inline distT="0" distB="0" distL="0" distR="0" wp14:anchorId="2BEC90AE" wp14:editId="7A8FBF8A">
             <wp:extent cx="5943600" cy="3835400"/>
@@ -1401,15 +1327,7 @@
         <w:t>Generate Lighting</w:t>
       </w:r>
       <w:r>
-        <w:t xml:space="preserve"> to </w:t>
-      </w:r>
-      <w:proofErr w:type="spellStart"/>
-      <w:r>
-        <w:t>rebake</w:t>
-      </w:r>
-      <w:proofErr w:type="spellEnd"/>
-      <w:r>
-        <w:t xml:space="preserve"> the scene lighting. Remember, this process may take some time to complete.</w:t>
+        <w:t xml:space="preserve"> to rebake the scene lighting. Remember, this process may take some time to complete.</w:t>
       </w:r>
     </w:p>
     <w:p>
@@ -1446,6 +1364,9 @@
     </w:p>
     <w:p>
       <w:r>
+        <w:rPr>
+          <w:noProof/>
+        </w:rPr>
         <w:drawing>
           <wp:inline distT="0" distB="0" distL="0" distR="0" wp14:anchorId="2D772380" wp14:editId="0FCFC5B1">
             <wp:extent cx="4267200" cy="3352800"/>
@@ -1511,6 +1432,9 @@
     </w:p>
     <w:p>
       <w:r>
+        <w:rPr>
+          <w:noProof/>
+        </w:rPr>
         <w:lastRenderedPageBreak/>
         <w:drawing>
           <wp:inline distT="0" distB="0" distL="0" distR="0" wp14:anchorId="4E99B97E" wp14:editId="1BCC7AF6">
@@ -1573,7 +1497,6 @@
       <w:r>
         <w:t xml:space="preserve">: If the Draw Mode view does not show the expected results, check that the </w:t>
       </w:r>
-      <w:proofErr w:type="spellStart"/>
       <w:r>
         <w:rPr>
           <w:b/>
@@ -1581,25 +1504,8 @@
         </w:rPr>
         <w:t>LightingBeam</w:t>
       </w:r>
-      <w:proofErr w:type="spellEnd"/>
-      <w:r>
-        <w:t xml:space="preserve"> </w:t>
-      </w:r>
-      <w:proofErr w:type="spellStart"/>
-      <w:r>
-        <w:t>GameObject</w:t>
-      </w:r>
-      <w:proofErr w:type="spellEnd"/>
-      <w:r>
-        <w:t xml:space="preserve"> is set as Static. If it is not set as Static, you will need to </w:t>
-      </w:r>
-      <w:proofErr w:type="spellStart"/>
-      <w:r>
-        <w:t>rebake</w:t>
-      </w:r>
-      <w:proofErr w:type="spellEnd"/>
-      <w:r>
-        <w:t xml:space="preserve"> the lighting.</w:t>
+      <w:r>
+        <w:t xml:space="preserve"> GameObject is set as Static. If it is not set as Static, you will need to rebake the lighting.</w:t>
       </w:r>
     </w:p>
     <w:p>
@@ -1723,15 +1629,7 @@
         </w:numPr>
       </w:pPr>
       <w:r>
-        <w:t xml:space="preserve">Remember to </w:t>
-      </w:r>
-      <w:proofErr w:type="spellStart"/>
-      <w:r>
-        <w:t>rebake</w:t>
-      </w:r>
-      <w:proofErr w:type="spellEnd"/>
-      <w:r>
-        <w:t xml:space="preserve"> the scene’s lightmap and then save your changes when you’re done.</w:t>
+        <w:t>Remember to rebake the scene’s lightmap and then save your changes when you’re done.</w:t>
       </w:r>
     </w:p>
     <w:p>
@@ -1758,16 +1656,8 @@
           <w:rPr>
             <w:rStyle w:val="Hyperlink"/>
           </w:rPr>
-          <w:t xml:space="preserve">High quality lighting using Light Probes by </w:t>
+          <w:t>High quality lighting using Light Probes by Brackeys</w:t>
         </w:r>
-        <w:proofErr w:type="spellStart"/>
-        <w:r>
-          <w:rPr>
-            <w:rStyle w:val="Hyperlink"/>
-          </w:rPr>
-          <w:t>Brackeys</w:t>
-        </w:r>
-        <w:proofErr w:type="spellEnd"/>
       </w:hyperlink>
       <w:r>
         <w:t xml:space="preserve"> (YouTube).</w:t>
@@ -3035,6 +2925,7 @@
   <w:style w:type="character" w:default="1" w:styleId="DefaultParagraphFont">
     <w:name w:val="Default Paragraph Font"/>
     <w:uiPriority w:val="1"/>
+    <w:semiHidden/>
     <w:unhideWhenUsed/>
   </w:style>
   <w:style w:type="table" w:default="1" w:styleId="TableNormal">

</xml_diff>